<commit_message>
Add: Filled basic info into the docs.
</commit_message>
<xml_diff>
--- a/AI-collaboration-documents/[AI-03] - FIT@HCMUS - AI Disclosure Form_Vn.docx
+++ b/AI-collaboration-documents/[AI-03] - FIT@HCMUS - AI Disclosure Form_Vn.docx
@@ -310,6 +310,7 @@
               <w:rPr>
                 <w:rtl w:val="0"/>
               </w:rPr>
+              <w:t xml:space="preserve">HW#</w:t>
             </w:r>
           </w:p>
         </w:tc>
@@ -442,6 +443,7 @@
               <w:rPr>
                 <w:rtl w:val="0"/>
               </w:rPr>
+              <w:t xml:space="preserve">20/09/2026</w:t>
             </w:r>
           </w:p>
         </w:tc>
@@ -483,6 +485,7 @@
               <w:rPr>
                 <w:rtl w:val="0"/>
               </w:rPr>
+              <w:t xml:space="preserve">Trần Đình Luân</w:t>
             </w:r>
           </w:p>
         </w:tc>
@@ -496,12 +499,17 @@
           <w:tcPr/>
           <w:p>
             <w:pPr>
+              <w:rPr/>
+            </w:pPr>
+            <w:r>
               <w:rPr>
                 <w:rFonts w:ascii="Arial" w:cs="Arial" w:eastAsia="Arial" w:hAnsi="Arial"/>
                 <w:sz w:val="21"/>
                 <w:szCs w:val="21"/>
-              </w:rPr>
-            </w:pPr>
+                <w:rtl w:val="0"/>
+              </w:rPr>
+              <w:t xml:space="preserve">MSSV:</w:t>
+            </w:r>
             <w:r>
               <w:rPr>
                 <w:rtl w:val="0"/>
@@ -519,47 +527,7 @@
               <w:rPr>
                 <w:rtl w:val="0"/>
               </w:rPr>
-            </w:r>
-          </w:p>
-        </w:tc>
-      </w:tr>
-      <w:tr>
-        <w:trPr>
-          <w:cantSplit w:val="0"/>
-          <w:tblHeader w:val="0"/>
-        </w:trPr>
-        <w:tc>
-          <w:tcPr/>
-          <w:p>
-            <w:pPr>
-              <w:rPr/>
-            </w:pPr>
-            <w:r>
-              <w:rPr>
-                <w:rFonts w:ascii="Arial" w:cs="Arial" w:eastAsia="Arial" w:hAnsi="Arial"/>
-                <w:sz w:val="21"/>
-                <w:szCs w:val="21"/>
-                <w:rtl w:val="0"/>
-              </w:rPr>
-              <w:t xml:space="preserve">MSSV:</w:t>
-            </w:r>
-            <w:r>
-              <w:rPr>
-                <w:rtl w:val="0"/>
-              </w:rPr>
-            </w:r>
-          </w:p>
-        </w:tc>
-        <w:tc>
-          <w:tcPr/>
-          <w:p>
-            <w:pPr>
-              <w:rPr/>
-            </w:pPr>
-            <w:r>
-              <w:rPr>
-                <w:rtl w:val="0"/>
-              </w:rPr>
+              <w:t xml:space="preserve">23120059</w:t>
             </w:r>
           </w:p>
         </w:tc>
@@ -1318,6 +1286,7 @@
               <w:rPr>
                 <w:rtl w:val="0"/>
               </w:rPr>
+              <w:t xml:space="preserve">TRẦN ĐÌNH LUÂN</w:t>
             </w:r>
           </w:p>
         </w:tc>
@@ -1361,6 +1330,7 @@
               <w:rPr>
                 <w:rtl w:val="0"/>
               </w:rPr>
+              <w:t xml:space="preserve">23120059</w:t>
             </w:r>
           </w:p>
         </w:tc>
@@ -1404,6 +1374,7 @@
               <w:rPr>
                 <w:rtl w:val="0"/>
               </w:rPr>
+              <w:t xml:space="preserve">23CTT1_3</w:t>
             </w:r>
           </w:p>
         </w:tc>
@@ -1499,6 +1470,7 @@
               <w:rPr>
                 <w:rtl w:val="0"/>
               </w:rPr>
+              <w:t xml:space="preserve">Lâm Quang Vũ</w:t>
             </w:r>
           </w:p>
         </w:tc>
@@ -1542,6 +1514,7 @@
               <w:rPr>
                 <w:rtl w:val="0"/>
               </w:rPr>
+              <w:t xml:space="preserve">20/09/2026</w:t>
             </w:r>
           </w:p>
         </w:tc>
@@ -2762,19 +2735,4 @@
   </a:objectDefaults>
   <a:extraClrSchemeLst/>
 </a:theme>
-</file>
-
-<file path=customXML/item1.xml><?xml version="1.0" encoding="utf-8"?>
-<go:gDocsCustomXmlDataStorage xmlns:go="http://customooxmlschemas.google.com/" xmlns:r="http://schemas.openxmlformats.org/officeDocument/2006/relationships" uri="GoogleDocsCustomDataVersion2">
-  <go:docsCustomData xmlns:go="http://customooxmlschemas.google.com/" roundtripDataSignature="AMtx7mhhdMbh4bTrw1KoSJTMb9cHAHE8qw==">CgMxLjA4AHIhMTQ3anR3eXBoTm1UejdidnZTTUdsal9tWmJVSTVtY0pl</go:docsCustomData>
-</go:gDocsCustomXmlDataStorage>
-</file>
-
-<file path=customXML/itemProps1.xml><?xml version="1.0" encoding="utf-8"?>
-<ds:datastoreItem xmlns:ds="http://schemas.openxmlformats.org/officeDocument/2006/customXml" ds:itemID="{11111111-1234-1234-1234-123412341234}">
-  <ds:schemaRefs>
-    <ds:schemaRef ds:uri="http://schemas.openxmlformats.org/officeDocument/2006/relationships"/>
-    <ds:schemaRef ds:uri="http://customooxmlschemas.google.com/"/>
-  </ds:schemaRefs>
-</ds:datastoreItem>
 </file>
</xml_diff>